<commit_message>
Se agrega tiempo experiencia
</commit_message>
<xml_diff>
--- a/src/assets/PlantillaDos.docx
+++ b/src/assets/PlantillaDos.docx
@@ -77,12 +77,21 @@
           </wp:anchor>
         </w:drawing>
       </w:r>
+      <w:proofErr w:type="spellStart"/>
       <w:r>
         <w:rPr>
           <w:color w:val="45B0E1" w:themeColor="accent1" w:themeTint="99"/>
           <w:lang w:val="es-ES"/>
         </w:rPr>
-        <w:t>Curriculum Vitae</w:t>
+        <w:t>Curriculum</w:t>
+      </w:r>
+      <w:proofErr w:type="spellEnd"/>
+      <w:r>
+        <w:rPr>
+          <w:color w:val="45B0E1" w:themeColor="accent1" w:themeTint="99"/>
+          <w:lang w:val="es-ES"/>
+        </w:rPr>
+        <w:t xml:space="preserve"> Vitae</w:t>
       </w:r>
     </w:p>
     <w:p>
@@ -140,6 +149,7 @@
         </w:rPr>
         <w:t>{</w:t>
       </w:r>
+      <w:proofErr w:type="spellStart"/>
       <w:r>
         <w:rPr>
           <w:b/>
@@ -160,6 +170,7 @@
         </w:rPr>
         <w:t>tNom</w:t>
       </w:r>
+      <w:proofErr w:type="spellEnd"/>
       <w:r>
         <w:rPr>
           <w:b/>
@@ -190,6 +201,7 @@
         </w:rPr>
         <w:t>{</w:t>
       </w:r>
+      <w:proofErr w:type="spellStart"/>
       <w:r>
         <w:rPr>
           <w:u w:val="single"/>
@@ -197,6 +209,7 @@
         </w:rPr>
         <w:t>EtEd</w:t>
       </w:r>
+      <w:proofErr w:type="spellEnd"/>
       <w:r>
         <w:rPr>
           <w:lang w:val="es-ES"/>
@@ -206,32 +219,26 @@
     </w:p>
     <w:p>
       <w:pPr>
-        <w:spacing w:after="60"/>
-        <w:rPr>
-          <w:lang w:val="es-ES"/>
-        </w:rPr>
-      </w:pPr>
-      <w:r>
-        <w:t>Nacionalidad:</w:t>
-      </w:r>
-      <w:r>
-        <w:rPr>
-          <w:lang w:val="es-ES"/>
-        </w:rPr>
-        <w:t xml:space="preserve"> </w:t>
-      </w:r>
-      <w:r>
-        <w:rPr>
-          <w:lang w:val="es-ES"/>
-        </w:rPr>
-        <w:t>{</w:t>
-      </w:r>
-      <w:r>
-        <w:rPr>
-          <w:lang w:val="es-ES"/>
-        </w:rPr>
-        <w:t>EtNa</w:t>
-      </w:r>
+        <w:spacing w:after="0"/>
+        <w:jc w:val="both"/>
+      </w:pPr>
+      <w:r>
+        <w:rPr>
+          <w:lang w:val="es-ES"/>
+        </w:rPr>
+        <w:t xml:space="preserve">Años de experiencia </w:t>
+      </w:r>
+      <w:r>
+        <w:rPr>
+          <w:lang w:val="es-ES"/>
+        </w:rPr>
+        <w:t>profesional: {</w:t>
+      </w:r>
+      <w:proofErr w:type="spellStart"/>
+      <w:r>
+        <w:t>EtTiempoExp</w:t>
+      </w:r>
+      <w:proofErr w:type="spellEnd"/>
       <w:r>
         <w:rPr>
           <w:lang w:val="es-ES"/>
@@ -247,6 +254,43 @@
         </w:rPr>
       </w:pPr>
       <w:r>
+        <w:t>Nacionalidad:</w:t>
+      </w:r>
+      <w:r>
+        <w:rPr>
+          <w:lang w:val="es-ES"/>
+        </w:rPr>
+        <w:t xml:space="preserve"> </w:t>
+      </w:r>
+      <w:r>
+        <w:rPr>
+          <w:lang w:val="es-ES"/>
+        </w:rPr>
+        <w:t>{</w:t>
+      </w:r>
+      <w:proofErr w:type="spellStart"/>
+      <w:r>
+        <w:rPr>
+          <w:lang w:val="es-ES"/>
+        </w:rPr>
+        <w:t>EtNa</w:t>
+      </w:r>
+      <w:proofErr w:type="spellEnd"/>
+      <w:r>
+        <w:rPr>
+          <w:lang w:val="es-ES"/>
+        </w:rPr>
+        <w:t>}</w:t>
+      </w:r>
+    </w:p>
+    <w:p>
+      <w:pPr>
+        <w:spacing w:after="60"/>
+        <w:rPr>
+          <w:lang w:val="es-ES"/>
+        </w:rPr>
+      </w:pPr>
+      <w:r>
         <w:rPr>
           <w:lang w:val="es-ES"/>
         </w:rPr>
@@ -304,7 +348,21 @@
         <w:rPr>
           <w:lang w:val="es-ES"/>
         </w:rPr>
-        <w:t>{/EtId}</w:t>
+        <w:t>{/</w:t>
+      </w:r>
+      <w:proofErr w:type="spellStart"/>
+      <w:r>
+        <w:rPr>
+          <w:lang w:val="es-ES"/>
+        </w:rPr>
+        <w:t>EtId</w:t>
+      </w:r>
+      <w:proofErr w:type="spellEnd"/>
+      <w:r>
+        <w:rPr>
+          <w:lang w:val="es-ES"/>
+        </w:rPr>
+        <w:t>}</w:t>
       </w:r>
     </w:p>
     <w:p>
@@ -333,12 +391,14 @@
         </w:rPr>
         <w:t>{</w:t>
       </w:r>
+      <w:proofErr w:type="spellStart"/>
       <w:r>
         <w:rPr>
           <w:lang w:val="es-ES"/>
         </w:rPr>
         <w:t>EtRe</w:t>
       </w:r>
+      <w:proofErr w:type="spellEnd"/>
       <w:r>
         <w:rPr>
           <w:lang w:val="es-ES"/>
@@ -349,7 +409,7 @@
     <w:tbl>
       <w:tblPr>
         <w:tblStyle w:val="Tablaconcuadrcula"/>
-        <w:tblpPr w:leftFromText="141" w:rightFromText="141" w:horzAnchor="margin" w:tblpY="3229"/>
+        <w:tblpPr w:leftFromText="141" w:rightFromText="141" w:vertAnchor="page" w:horzAnchor="margin" w:tblpY="4186"/>
         <w:tblW w:w="0" w:type="auto"/>
         <w:tblBorders>
           <w:top w:val="single" w:sz="12" w:space="0" w:color="ADADAD" w:themeColor="background2" w:themeShade="BF"/>
@@ -505,7 +565,21 @@
               <w:rPr>
                 <w:lang w:val="es-ES"/>
               </w:rPr>
-              <w:t>{descripcion}</w:t>
+              <w:t>{</w:t>
+            </w:r>
+            <w:proofErr w:type="spellStart"/>
+            <w:r>
+              <w:rPr>
+                <w:lang w:val="es-ES"/>
+              </w:rPr>
+              <w:t>descripcion</w:t>
+            </w:r>
+            <w:proofErr w:type="spellEnd"/>
+            <w:r>
+              <w:rPr>
+                <w:lang w:val="es-ES"/>
+              </w:rPr>
+              <w:t>}</w:t>
             </w:r>
           </w:p>
           <w:p>
@@ -711,32 +785,51 @@
                 <w:bCs/>
                 <w:lang w:val="es-ES"/>
               </w:rPr>
-              <w:t xml:space="preserve"> {fechaIni}</w:t>
-            </w:r>
-          </w:p>
-          <w:p>
-            <w:pPr>
-              <w:spacing w:after="60"/>
+              <w:t xml:space="preserve"> {</w:t>
+            </w:r>
+            <w:proofErr w:type="spellStart"/>
+            <w:r>
               <w:rPr>
                 <w:b/>
                 <w:bCs/>
                 <w:lang w:val="es-ES"/>
               </w:rPr>
-            </w:pPr>
-            <w:r>
-              <w:rPr>
-                <w:lang w:val="es-ES"/>
-              </w:rPr>
-              <w:t>Generación:</w:t>
-            </w:r>
+              <w:t>fechaIni</w:t>
+            </w:r>
+            <w:proofErr w:type="spellEnd"/>
             <w:r>
               <w:rPr>
                 <w:b/>
                 <w:bCs/>
                 <w:lang w:val="es-ES"/>
               </w:rPr>
+              <w:t>}</w:t>
+            </w:r>
+          </w:p>
+          <w:p>
+            <w:pPr>
+              <w:spacing w:after="60"/>
+              <w:rPr>
+                <w:b/>
+                <w:bCs/>
+                <w:lang w:val="es-ES"/>
+              </w:rPr>
+            </w:pPr>
+            <w:r>
+              <w:rPr>
+                <w:lang w:val="es-ES"/>
+              </w:rPr>
+              <w:t>Generación:</w:t>
+            </w:r>
+            <w:r>
+              <w:rPr>
+                <w:b/>
+                <w:bCs/>
+                <w:lang w:val="es-ES"/>
+              </w:rPr>
               <w:t xml:space="preserve"> {</w:t>
             </w:r>
+            <w:proofErr w:type="spellStart"/>
             <w:r>
               <w:rPr>
                 <w:b/>
@@ -746,6 +839,7 @@
               </w:rPr>
               <w:t>generacion</w:t>
             </w:r>
+            <w:proofErr w:type="spellEnd"/>
             <w:r>
               <w:rPr>
                 <w:b/>
@@ -927,7 +1021,15 @@
               <w:spacing w:after="60"/>
             </w:pPr>
             <w:r>
-              <w:t>{organizacion}</w:t>
+              <w:t>{</w:t>
+            </w:r>
+            <w:proofErr w:type="spellStart"/>
+            <w:r>
+              <w:t>organizacion</w:t>
+            </w:r>
+            <w:proofErr w:type="spellEnd"/>
+            <w:r>
+              <w:t>}</w:t>
             </w:r>
           </w:p>
           <w:p>
@@ -945,9 +1047,11 @@
             <w:r>
               <w:t>{entidad} - {</w:t>
             </w:r>
+            <w:proofErr w:type="spellStart"/>
             <w:r>
               <w:t>tiempoEstudio</w:t>
             </w:r>
+            <w:proofErr w:type="spellEnd"/>
             <w:r>
               <w:t>}</w:t>
             </w:r>
@@ -958,7 +1062,15 @@
               <w:jc w:val="both"/>
             </w:pPr>
             <w:r>
-              <w:t>{descripcion}</w:t>
+              <w:t>{</w:t>
+            </w:r>
+            <w:proofErr w:type="spellStart"/>
+            <w:r>
+              <w:t>descripcion</w:t>
+            </w:r>
+            <w:proofErr w:type="spellEnd"/>
+            <w:r>
+              <w:t>}</w:t>
             </w:r>
           </w:p>
           <w:p>
@@ -974,7 +1086,15 @@
               <w:spacing w:after="60"/>
             </w:pPr>
             <w:r>
-              <w:t>{/tieneCursos}</w:t>
+              <w:t>{/</w:t>
+            </w:r>
+            <w:proofErr w:type="spellStart"/>
+            <w:r>
+              <w:t>tieneCursos</w:t>
+            </w:r>
+            <w:proofErr w:type="spellEnd"/>
+            <w:r>
+              <w:t>}</w:t>
             </w:r>
           </w:p>
         </w:tc>
@@ -1087,12 +1207,14 @@
               </w:rPr>
               <w:t>{/</w:t>
             </w:r>
+            <w:proofErr w:type="spellStart"/>
             <w:r>
               <w:rPr>
                 <w:color w:val="000000" w:themeColor="text1"/>
               </w:rPr>
               <w:t>tieneConocimientos</w:t>
             </w:r>
+            <w:proofErr w:type="spellEnd"/>
             <w:r>
               <w:rPr>
                 <w:color w:val="000000" w:themeColor="text1"/>
@@ -1117,12 +1239,14 @@
               </w:rPr>
               <w:t>{#</w:t>
             </w:r>
+            <w:proofErr w:type="spellStart"/>
             <w:r>
               <w:rPr>
                 <w:color w:val="000000" w:themeColor="text1"/>
               </w:rPr>
               <w:t>tieneSkills</w:t>
             </w:r>
+            <w:proofErr w:type="spellEnd"/>
             <w:r>
               <w:rPr>
                 <w:color w:val="000000" w:themeColor="text1"/>
@@ -1268,7 +1392,21 @@
               <w:rPr>
                 <w:lang w:val="es-ES"/>
               </w:rPr>
-              <w:t>{skill}</w:t>
+              <w:t>{</w:t>
+            </w:r>
+            <w:proofErr w:type="spellStart"/>
+            <w:r>
+              <w:rPr>
+                <w:lang w:val="es-ES"/>
+              </w:rPr>
+              <w:t>skill</w:t>
+            </w:r>
+            <w:proofErr w:type="spellEnd"/>
+            <w:r>
+              <w:rPr>
+                <w:lang w:val="es-ES"/>
+              </w:rPr>
+              <w:t>}</w:t>
             </w:r>
           </w:p>
           <w:p>
@@ -1301,7 +1439,23 @@
                 <w:color w:val="000000" w:themeColor="text1"/>
                 <w:lang w:val="es-ES"/>
               </w:rPr>
-              <w:t>{/tieneSkills}</w:t>
+              <w:t>{/</w:t>
+            </w:r>
+            <w:proofErr w:type="spellStart"/>
+            <w:r>
+              <w:rPr>
+                <w:color w:val="000000" w:themeColor="text1"/>
+                <w:lang w:val="es-ES"/>
+              </w:rPr>
+              <w:t>tieneSkills</w:t>
+            </w:r>
+            <w:proofErr w:type="spellEnd"/>
+            <w:r>
+              <w:rPr>
+                <w:color w:val="000000" w:themeColor="text1"/>
+                <w:lang w:val="es-ES"/>
+              </w:rPr>
+              <w:t>}</w:t>
             </w:r>
           </w:p>
           <w:p>
@@ -1437,7 +1591,15 @@
               <w:ind w:left="708"/>
             </w:pPr>
             <w:r>
-              <w:t>{/tieneComentarios}</w:t>
+              <w:t>{/</w:t>
+            </w:r>
+            <w:proofErr w:type="spellStart"/>
+            <w:r>
+              <w:t>tieneComentarios</w:t>
+            </w:r>
+            <w:proofErr w:type="spellEnd"/>
+            <w:r>
+              <w:t>}</w:t>
             </w:r>
           </w:p>
           <w:p>

</xml_diff>